<commit_message>
auto: Claude session changes (2026-05-27 16:51)
</commit_message>
<xml_diff>
--- a/docs/BMS 业务操作手册.docx
+++ b/docs/BMS 业务操作手册.docx
@@ -44,8 +44,6 @@
         </w:rPr>
         <w:t xml:space="preserve"> / 服务中心 / 申请人</w:t>
       </w:r>
-      <w:bookmarkStart w:id="0" w:name="_GoBack"/>
-      <w:bookmarkEnd w:id="0"/>
     </w:p>
     <w:p>
       <w:pPr>
@@ -242,10 +240,10 @@
       </w:pPr>
       <w:r>
         <w:drawing>
-          <wp:inline distT="0" distB="0" distL="0" distR="0">
-            <wp:extent cx="5143500" cy="3209925"/>
-            <wp:effectExtent l="0" t="0" r="0" b="0"/>
-            <wp:docPr id="1" name="bms_01_draft_list.png" descr="bms_01_draft_list.png" title="bms_01_draft_list.png"/>
+          <wp:inline distT="0" distB="0" distL="114300" distR="114300">
+            <wp:extent cx="6184900" cy="2803525"/>
+            <wp:effectExtent l="0" t="0" r="12700" b="15875"/>
+            <wp:docPr id="5" name="图片 1"/>
             <wp:cNvGraphicFramePr>
               <a:graphicFrameLocks xmlns:a="http://schemas.openxmlformats.org/drawingml/2006/main" noChangeAspect="1"/>
             </wp:cNvGraphicFramePr>
@@ -253,14 +251,13 @@
               <a:graphicData uri="http://schemas.openxmlformats.org/drawingml/2006/picture">
                 <pic:pic xmlns:pic="http://schemas.openxmlformats.org/drawingml/2006/picture">
                   <pic:nvPicPr>
-                    <pic:cNvPr id="1" name="bms_01_draft_list.png" descr="bms_01_draft_list.png" title="bms_01_draft_list.png"/>
+                    <pic:cNvPr id="5" name="图片 1"/>
                     <pic:cNvPicPr>
-                      <a:picLocks noChangeAspect="1" noChangeArrowheads="1"/>
+                      <a:picLocks noChangeAspect="1"/>
                     </pic:cNvPicPr>
                   </pic:nvPicPr>
                   <pic:blipFill>
                     <a:blip r:embed="rId6"/>
-                    <a:srcRect/>
                     <a:stretch>
                       <a:fillRect/>
                     </a:stretch>
@@ -268,11 +265,15 @@
                   <pic:spPr>
                     <a:xfrm>
                       <a:off x="0" y="0"/>
-                      <a:ext cx="5143500" cy="3209925"/>
+                      <a:ext cx="6184900" cy="2803525"/>
                     </a:xfrm>
                     <a:prstGeom prst="rect">
                       <a:avLst/>
                     </a:prstGeom>
+                    <a:noFill/>
+                    <a:ln>
+                      <a:noFill/>
+                    </a:ln>
                   </pic:spPr>
                 </pic:pic>
               </a:graphicData>
@@ -285,17 +286,44 @@
       <w:pPr>
         <w:pStyle w:val="8"/>
         <w:jc w:val="center"/>
-      </w:pPr>
-      <w:r>
-        <w:rPr>
-          <w:rFonts w:ascii="微软雅黑" w:hAnsi="微软雅黑" w:eastAsia="微软雅黑" w:cs="微软雅黑"/>
-          <w:i/>
-          <w:iCs/>
+        <w:rPr>
+          <w:i w:val="0"/>
+          <w:iCs w:val="0"/>
+        </w:rPr>
+      </w:pPr>
+      <w:r>
+        <w:rPr>
+          <w:rFonts w:ascii="微软雅黑" w:hAnsi="微软雅黑" w:eastAsia="微软雅黑" w:cs="微软雅黑"/>
+          <w:i w:val="0"/>
+          <w:iCs w:val="0"/>
           <w:color w:val="595959"/>
           <w:sz w:val="18"/>
           <w:szCs w:val="18"/>
         </w:rPr>
-        <w:t>图　1：BMS 批量结算 — 「待提交」tab</w:t>
+        <w:t>图　1：BMS 批量结算 — 「</w:t>
+      </w:r>
+      <w:r>
+        <w:rPr>
+          <w:rFonts w:hint="eastAsia" w:cs="微软雅黑"/>
+          <w:i w:val="0"/>
+          <w:iCs w:val="0"/>
+          <w:color w:val="595959"/>
+          <w:sz w:val="18"/>
+          <w:szCs w:val="18"/>
+          <w:lang w:val="en-US" w:eastAsia="zh-CN"/>
+        </w:rPr>
+        <w:t>全部</w:t>
+      </w:r>
+      <w:r>
+        <w:rPr>
+          <w:rFonts w:ascii="微软雅黑" w:hAnsi="微软雅黑" w:eastAsia="微软雅黑" w:cs="微软雅黑"/>
+          <w:i w:val="0"/>
+          <w:iCs w:val="0"/>
+          <w:color w:val="595959"/>
+          <w:sz w:val="18"/>
+          <w:szCs w:val="18"/>
+        </w:rPr>
+        <w:t>」tab</w:t>
       </w:r>
     </w:p>
     <w:p>
@@ -773,8 +801,6 @@
       <w:pPr>
         <w:pStyle w:val="8"/>
         <w:jc w:val="center"/>
-      </w:pPr>
-      <w:r>
         <w:rPr>
           <w:rFonts w:ascii="微软雅黑" w:hAnsi="微软雅黑" w:eastAsia="微软雅黑" w:cs="微软雅黑"/>
           <w:i/>
@@ -783,8 +809,153 @@
           <w:sz w:val="18"/>
           <w:szCs w:val="18"/>
         </w:rPr>
+      </w:pPr>
+      <w:r>
+        <w:rPr>
+          <w:rFonts w:ascii="微软雅黑" w:hAnsi="微软雅黑" w:eastAsia="微软雅黑" w:cs="微软雅黑"/>
+          <w:i/>
+          <w:iCs/>
+          <w:color w:val="595959"/>
+          <w:sz w:val="18"/>
+          <w:szCs w:val="18"/>
+        </w:rPr>
         <w:t>图　3：申请表单 — U8 费用类型由勾选车辆自动带入，不可修改</w:t>
       </w:r>
+    </w:p>
+    <w:p>
+      <w:pPr>
+        <w:pStyle w:val="8"/>
+        <w:jc w:val="center"/>
+        <w:rPr>
+          <w:rFonts w:ascii="微软雅黑" w:hAnsi="微软雅黑" w:eastAsia="微软雅黑" w:cs="微软雅黑"/>
+          <w:i/>
+          <w:iCs/>
+          <w:color w:val="595959"/>
+          <w:sz w:val="18"/>
+          <w:szCs w:val="18"/>
+        </w:rPr>
+      </w:pPr>
+    </w:p>
+    <w:p>
+      <w:pPr>
+        <w:pStyle w:val="8"/>
+        <w:jc w:val="center"/>
+        <w:rPr>
+          <w:rFonts w:ascii="微软雅黑" w:hAnsi="微软雅黑" w:eastAsia="微软雅黑" w:cs="微软雅黑"/>
+          <w:i/>
+          <w:iCs/>
+          <w:color w:val="595959"/>
+          <w:sz w:val="18"/>
+          <w:szCs w:val="18"/>
+        </w:rPr>
+      </w:pPr>
+    </w:p>
+    <w:p>
+      <w:pPr>
+        <w:pStyle w:val="8"/>
+        <w:jc w:val="center"/>
+      </w:pPr>
+      <w:r>
+        <w:drawing>
+          <wp:inline distT="0" distB="0" distL="114300" distR="114300">
+            <wp:extent cx="4194810" cy="3577590"/>
+            <wp:effectExtent l="0" t="0" r="21590" b="3810"/>
+            <wp:docPr id="7" name="图片 3"/>
+            <wp:cNvGraphicFramePr>
+              <a:graphicFrameLocks xmlns:a="http://schemas.openxmlformats.org/drawingml/2006/main" noChangeAspect="1"/>
+            </wp:cNvGraphicFramePr>
+            <a:graphic xmlns:a="http://schemas.openxmlformats.org/drawingml/2006/main">
+              <a:graphicData uri="http://schemas.openxmlformats.org/drawingml/2006/picture">
+                <pic:pic xmlns:pic="http://schemas.openxmlformats.org/drawingml/2006/picture">
+                  <pic:nvPicPr>
+                    <pic:cNvPr id="7" name="图片 3"/>
+                    <pic:cNvPicPr>
+                      <a:picLocks noChangeAspect="1"/>
+                    </pic:cNvPicPr>
+                  </pic:nvPicPr>
+                  <pic:blipFill>
+                    <a:blip r:embed="rId9"/>
+                    <a:stretch>
+                      <a:fillRect/>
+                    </a:stretch>
+                  </pic:blipFill>
+                  <pic:spPr>
+                    <a:xfrm>
+                      <a:off x="0" y="0"/>
+                      <a:ext cx="4194810" cy="3577590"/>
+                    </a:xfrm>
+                    <a:prstGeom prst="rect">
+                      <a:avLst/>
+                    </a:prstGeom>
+                    <a:noFill/>
+                    <a:ln>
+                      <a:noFill/>
+                    </a:ln>
+                  </pic:spPr>
+                </pic:pic>
+              </a:graphicData>
+            </a:graphic>
+          </wp:inline>
+        </w:drawing>
+      </w:r>
+    </w:p>
+    <w:p>
+      <w:pPr>
+        <w:pStyle w:val="8"/>
+        <w:jc w:val="center"/>
+        <w:rPr>
+          <w:rFonts w:hint="default" w:eastAsia="微软雅黑"/>
+          <w:lang w:val="en-US" w:eastAsia="zh-CN"/>
+        </w:rPr>
+      </w:pPr>
+      <w:r>
+        <w:rPr>
+          <w:rFonts w:ascii="微软雅黑" w:hAnsi="微软雅黑" w:eastAsia="微软雅黑" w:cs="微软雅黑"/>
+          <w:i/>
+          <w:iCs/>
+          <w:color w:val="595959"/>
+          <w:sz w:val="18"/>
+          <w:szCs w:val="18"/>
+        </w:rPr>
+        <w:t>图　</w:t>
+      </w:r>
+      <w:r>
+        <w:rPr>
+          <w:rFonts w:hint="eastAsia" w:cs="微软雅黑"/>
+          <w:i/>
+          <w:iCs/>
+          <w:color w:val="595959"/>
+          <w:sz w:val="18"/>
+          <w:szCs w:val="18"/>
+          <w:lang w:val="en-US" w:eastAsia="zh-CN"/>
+        </w:rPr>
+        <w:t>4</w:t>
+      </w:r>
+      <w:r>
+        <w:rPr>
+          <w:rFonts w:ascii="微软雅黑" w:hAnsi="微软雅黑" w:eastAsia="微软雅黑" w:cs="微软雅黑"/>
+          <w:i/>
+          <w:iCs/>
+          <w:color w:val="595959"/>
+          <w:sz w:val="18"/>
+          <w:szCs w:val="18"/>
+        </w:rPr>
+        <w:t>：申请表单 —</w:t>
+      </w:r>
+      <w:r>
+        <w:rPr>
+          <w:rFonts w:hint="eastAsia" w:cs="微软雅黑"/>
+          <w:i/>
+          <w:iCs/>
+          <w:color w:val="595959"/>
+          <w:sz w:val="18"/>
+          <w:szCs w:val="18"/>
+          <w:lang w:val="en-US" w:eastAsia="zh-CN"/>
+        </w:rPr>
+        <w:t>查看申请单</w:t>
+      </w:r>
+      <w:bookmarkStart w:id="0" w:name="_GoBack"/>
+      <w:bookmarkEnd w:id="0"/>
     </w:p>
     <w:tbl>
       <w:tblPr>
@@ -895,9 +1066,10 @@
       <w:pPr>
         <w:pStyle w:val="2"/>
         <w:rPr>
-          <w:rFonts w:ascii="微软雅黑" w:hAnsi="微软雅黑" w:eastAsia="微软雅黑" w:cs="微软雅黑"/>
-          <w:b/>
-          <w:bCs/>
+          <w:rFonts w:hint="default" w:ascii="微软雅黑" w:hAnsi="微软雅黑" w:eastAsia="微软雅黑" w:cs="微软雅黑"/>
+          <w:b/>
+          <w:bCs/>
+          <w:lang w:val="en-US" w:eastAsia="zh-CN"/>
         </w:rPr>
       </w:pPr>
     </w:p>
@@ -1043,7 +1215,7 @@
                     </pic:cNvPicPr>
                   </pic:nvPicPr>
                   <pic:blipFill>
-                    <a:blip r:embed="rId9"/>
+                    <a:blip r:embed="rId10"/>
                     <a:srcRect/>
                     <a:stretch>
                       <a:fillRect/>

</xml_diff>